<commit_message>
Adding Exam2 and Exam2_Answer
</commit_message>
<xml_diff>
--- a/Git_Exam/Exam2/Git_Question_2.docx
+++ b/Git_Exam/Exam2/Git_Question_2.docx
@@ -42,7 +42,21 @@
           <w:szCs w:val="28"/>
         </w:rPr>
         <w:br/>
-        <w:t>b) Tạo nhánh hotfix và tạo Conflict có chủ ý</w:t>
+        <w:t xml:space="preserve">b) Tạo nhánh </w:t>
+      </w:r>
+      <w:r>
+        <w:rPr>
+          <w:sz w:val="28"/>
+          <w:szCs w:val="28"/>
+        </w:rPr>
+        <w:t>feature2</w:t>
+      </w:r>
+      <w:r>
+        <w:rPr>
+          <w:sz w:val="28"/>
+          <w:szCs w:val="28"/>
+        </w:rPr>
+        <w:t xml:space="preserve"> và tạo Conflict có chủ ý</w:t>
       </w:r>
       <w:r>
         <w:rPr>

</xml_diff>